<commit_message>
Add and update project documentation files
Added a new .docx file and updated existing .docx and .md documentation files. The markdown file had its summary section removed for conciseness.
</commit_message>
<xml_diff>
--- a/机器人/大作业兼考试题(1).docx
+++ b/机器人/大作业兼考试题(1).docx
@@ -153,7 +153,8 @@
       <w:pPr>
         <w:ind w:firstLine="440" w:firstLineChars="200"/>
         <w:rPr>
-          <w:rFonts w:hint="eastAsia"/>
+          <w:rFonts w:hint="default"/>
+          <w:lang w:val="en-US" w:eastAsia="zh-CN"/>
         </w:rPr>
       </w:pPr>
       <w:r>
@@ -162,167 +163,8 @@
         </w:rPr>
         <w:t>5、假设作为一个创业团队，自由选择一种感兴趣的机器人开展总体设计（简略）及软件架构设计（详细）。</w:t>
       </w:r>
-    </w:p>
-    <w:p>
-      <w:pPr>
-        <w:rPr>
-          <w:rFonts w:hint="eastAsia"/>
-        </w:rPr>
-      </w:pPr>
-    </w:p>
-    <w:p>
-      <w:pPr>
-        <w:ind w:firstLine="440" w:firstLineChars="200"/>
-        <w:rPr>
-          <w:rFonts w:hint="eastAsia"/>
-        </w:rPr>
-      </w:pPr>
-    </w:p>
-    <w:p>
-      <w:pPr>
-        <w:ind w:firstLine="440" w:firstLineChars="200"/>
-        <w:rPr>
-          <w:rFonts w:hint="eastAsia"/>
-        </w:rPr>
-      </w:pPr>
       <w:bookmarkStart w:id="0" w:name="_GoBack"/>
       <w:bookmarkEnd w:id="0"/>
-      <w:r>
-        <w:rPr>
-          <w:rFonts w:hint="eastAsia"/>
-        </w:rPr>
-        <w:t>设计工厂一个不少于1000个无人节点（AGV、MIR、人形机器人、四足机器人等）的自主规划调度软件系统</w:t>
-      </w:r>
-    </w:p>
-    <w:p>
-      <w:pPr>
-        <w:ind w:firstLine="440" w:firstLineChars="200"/>
-        <w:rPr>
-          <w:rFonts w:hint="eastAsia"/>
-        </w:rPr>
-      </w:pPr>
-      <w:r>
-        <w:rPr>
-          <w:rFonts w:hint="eastAsia"/>
-        </w:rPr>
-        <w:t>我使用的是C++语言，在CLion中文版中进行代码运行，使用CMAKE进行管理，工具链是ucrt64，CMAKE4.1.2,构建工具是ninja，GDB 15.2</w:t>
-      </w:r>
-    </w:p>
-    <w:p>
-      <w:pPr>
-        <w:ind w:firstLine="440" w:firstLineChars="200"/>
-        <w:rPr>
-          <w:rFonts w:hint="eastAsia"/>
-          <w:lang w:val="en-US" w:eastAsia="zh-CN"/>
-        </w:rPr>
-      </w:pPr>
-      <w:r>
-        <w:rPr>
-          <w:rFonts w:hint="eastAsia"/>
-          <w:lang w:val="en-US" w:eastAsia="zh-CN"/>
-        </w:rPr>
-        <w:t>我希望1000到3000个节点放置在一个10000*10000的地图中对他们进行自主规划调度，初始时机器人全部生成在地图中心，且机器人出生所在的地方不存在障碍，在地图中有固定障碍5000-20000个（随机生成），系统以“1秒”的间隔随机生成任务点和结束点，使得系统可以将最近且没有任务的机器人调度到任务点然后以最近最快的路径到结束点，且在同一个块中不允许同时存在两个机器人。</w:t>
-      </w:r>
-    </w:p>
-    <w:p>
-      <w:pPr>
-        <w:ind w:firstLine="440" w:firstLineChars="200"/>
-        <w:rPr>
-          <w:rFonts w:hint="eastAsia"/>
-          <w:lang w:val="en-US" w:eastAsia="zh-CN"/>
-        </w:rPr>
-      </w:pPr>
-      <w:r>
-        <w:rPr>
-          <w:rFonts w:hint="eastAsia"/>
-          <w:lang w:val="en-US" w:eastAsia="zh-CN"/>
-        </w:rPr>
-        <w:t>我大致的算法打算采用大区域系统协调，小范围机器人自主规划的方式。</w:t>
-      </w:r>
-      <w:r>
-        <w:rPr>
-          <w:rFonts w:hint="eastAsia"/>
-        </w:rPr>
-        <w:t>我打算把系统分成前端，后端，数据库三个板块</w:t>
-      </w:r>
-      <w:r>
-        <w:rPr>
-          <w:rFonts w:hint="eastAsia"/>
-          <w:lang w:eastAsia="zh-CN"/>
-        </w:rPr>
-        <w:t>，</w:t>
-      </w:r>
-      <w:r>
-        <w:rPr>
-          <w:rFonts w:hint="eastAsia"/>
-          <w:lang w:val="en-US" w:eastAsia="zh-CN"/>
-        </w:rPr>
-        <w:t>前后端全部使用C++在Clion进行编写，数据库使用DataGrip进行编写</w:t>
-      </w:r>
-    </w:p>
-    <w:p>
-      <w:pPr>
-        <w:ind w:firstLine="440" w:firstLineChars="200"/>
-        <w:rPr>
-          <w:rFonts w:hint="eastAsia"/>
-          <w:lang w:val="en-US" w:eastAsia="zh-CN"/>
-        </w:rPr>
-      </w:pPr>
-      <w:r>
-        <w:rPr>
-          <w:rFonts w:hint="eastAsia"/>
-          <w:lang w:val="en-US" w:eastAsia="zh-CN"/>
-        </w:rPr>
-        <w:t>前端主要需要做一个可以实时观测机器人实时状态的页面，主要分成三个页面，第一个页面中心有一个按钮“开始调度”，点击之后跳转到第二个页面，其中有三个文字框可以让我输入机器人个数（1000-3000个），障碍个数（5000-20000个）和任务个数（60-15000个），并且还有一个“开始任务按钮”，彻底输入完三个数后才能点击开始任务按钮跳转到第三个页面并将输入的信息个数传输给后端，第三个页面显示由后端生成的地图等功能以一个二维10000*10000的地图显示出来并且可以以0.5秒的间隔刷新地图中所有机器人和任务的状态，一直到所有任务结束，弹出任务结束框并同时退出，第三个页面用户无法进行输入，只有一个退出按钮，当用户点击退出后，系统停止此进程并退出。</w:t>
-      </w:r>
-    </w:p>
-    <w:p>
-      <w:pPr>
-        <w:ind w:firstLine="440" w:firstLineChars="200"/>
-        <w:rPr>
-          <w:rFonts w:hint="default"/>
-          <w:lang w:val="en-US" w:eastAsia="zh-CN"/>
-        </w:rPr>
-      </w:pPr>
-      <w:r>
-        <w:rPr>
-          <w:rFonts w:hint="eastAsia"/>
-          <w:lang w:val="en-US" w:eastAsia="zh-CN"/>
-        </w:rPr>
-        <w:t>数据库需要保存生成的机器人的ID，位置以及其他的所需信息</w:t>
-      </w:r>
-    </w:p>
-    <w:p>
-      <w:pPr>
-        <w:ind w:firstLine="440" w:firstLineChars="200"/>
-        <w:rPr>
-          <w:rFonts w:hint="eastAsia"/>
-          <w:lang w:val="en-US" w:eastAsia="zh-CN"/>
-        </w:rPr>
-      </w:pPr>
-      <w:r>
-        <w:rPr>
-          <w:rFonts w:hint="eastAsia"/>
-          <w:lang w:val="en-US" w:eastAsia="zh-CN"/>
-        </w:rPr>
-        <w:t>后端的任务是生成对应的地图和机器人，使用我上文说的大区域系统协调，小范围机器人自主规划的方式进行协调，小范围时采用最快速的算法进行数据传输和路径规划。</w:t>
-      </w:r>
-    </w:p>
-    <w:p>
-      <w:pPr>
-        <w:ind w:firstLine="440" w:firstLineChars="200"/>
-        <w:rPr>
-          <w:rFonts w:hint="default"/>
-          <w:lang w:val="en-US" w:eastAsia="zh-CN"/>
-        </w:rPr>
-      </w:pPr>
-      <w:r>
-        <w:rPr>
-          <w:rFonts w:hint="eastAsia"/>
-          <w:lang w:val="en-US" w:eastAsia="zh-CN"/>
-        </w:rPr>
-        <w:t>根据这个帮我生成一个完整的项目。</w:t>
-      </w:r>
     </w:p>
     <w:sectPr>
       <w:pgSz w:w="11906" w:h="16838"/>
@@ -427,7 +269,7 @@
     <w:lsdException w:uiPriority="99" w:name="footnote text"/>
     <w:lsdException w:uiPriority="99" w:name="annotation text"/>
     <w:lsdException w:uiPriority="99" w:semiHidden="0" w:name="header"/>
-    <w:lsdException w:uiPriority="99" w:semiHidden="0" w:name="footer"/>
+    <w:lsdException w:qFormat="1" w:uiPriority="99" w:semiHidden="0" w:name="footer"/>
     <w:lsdException w:uiPriority="99" w:name="index heading"/>
     <w:lsdException w:qFormat="1" w:uiPriority="35" w:name="caption"/>
     <w:lsdException w:uiPriority="99" w:name="table of figures"/>
@@ -906,6 +748,7 @@
     <w:basedOn w:val="1"/>
     <w:link w:val="37"/>
     <w:unhideWhenUsed/>
+    <w:qFormat/>
     <w:uiPriority w:val="99"/>
     <w:pPr>
       <w:tabs>

</xml_diff>